<commit_message>
Generate complete Study 4 journal handoff
Co-authored-by: yuxuan980925 <yuxuan980925@users.noreply.github.com>
</commit_message>
<xml_diff>
--- a/Study4_Article_Complete/Study4_Manuscript.docx
+++ b/Study4_Article_Complete/Study4_Manuscript.docx
@@ -10,7 +10,7 @@
         <w:t xml:space="preserve">Study4_Manuscript</w:t>
       </w:r>
     </w:p>
-    <w:bookmarkStart w:id="72" w:name="Xa83f0a50215dd99b2a0e46de05e4f04c1d0bd71"/>
+    <w:bookmarkStart w:id="75" w:name="Xa83f0a50215dd99b2a0e46de05e4f04c1d0bd71"/>
     <w:p>
       <w:pPr>
         <w:pStyle w:val="Heading1"/>
@@ -78,7 +78,7 @@
         <w:pStyle w:val="FirstParagraph"/>
       </w:pPr>
       <w:r>
-        <w:t xml:space="preserve">This paper studies the civil-engineering economy under a generative-AI shock through two United Kingdom-centred relationships: UK–India and UK–China. Bilateral evidence covers technical and other business services (SJ3), construction services (SE), and computer and information services (SI). A panel of 17 EU importers supplies harmonised variation in enterprise use of natural-language-generation (NLG) AI. UK trends are descriptive; the panel tests whether importer adoption is associated with Indian Mode-1 services or Chinese project-based construction services. The shock is the 2023–24 change in Eurostat NLG use among professional-service enterprises. Domestic outcomes are turnover, employment, wages and value added in NACE M71 architectural and engineering activities; trade outcomes come from OECD–WTO BaTIS. Between 2019 and 2024, UK imports of Indian SJ3 rose 127.7% and UK imports of Chinese SJ3 rose 99.3%. In the importer panel, the India-only SJ3 coefficient is 0.021 (s.e. 0.008), whereas Chinese construction services are unrelated to importer NLG adoption (−0.008, s.e. 0.009). Domestic M71 turnover and wages grew more slowly in higher-adoption economies, while employment was unchanged. The evidence is consistent with generative tools changing the coordination of digitally deliverable services, especially between the UK and India. It does not show that AI caused the bilateral changes or that civil-engineering jobs or GDP relocated.</w:t>
+        <w:t xml:space="preserve">This paper studies the civil-engineering economy under a generative-AI shock through two United Kingdom-centred relationships: UK–India and UK–China. Bilateral evidence covers technical and other business services (SJ3), construction services (SE), and computer and information services (SI). A panel of 17 EU importers supplies harmonised variation in enterprise use of natural-language-generation (NLG) AI. UK trends are descriptive; the panel tests whether importer adoption is associated with Indian SJ3 services or Chinese project-based construction services. The shock is the 2023–24 change in Eurostat NLG use among professional-service enterprises. Domestic outcomes are turnover, employment, wages and value added in NACE M71 architectural and engineering activities; trade outcomes come from OECD–WTO BaTIS. Between 2019 and 2024, UK imports of Indian SJ3 rose 127.7% and UK imports of Chinese SJ3 rose 99.3%. In the importer panel, the India-only SJ3 coefficient is 0.021 (s.e. 0.008), whereas Chinese construction services are unrelated to importer NLG adoption (−0.008, s.e. 0.009). Domestic M71 turnover and wages grew more slowly in higher-adoption economies, while employment was unchanged. The pattern is consistent with generative tools changing the coordination of digitally deliverable services, especially between the UK and India. It does not show that AI caused the bilateral changes or that civil-engineering jobs or GDP relocated.</w:t>
       </w:r>
     </w:p>
     <w:p>
@@ -96,7 +96,7 @@
         <w:t xml:space="preserve"> </w:t>
       </w:r>
       <w:r>
-        <w:t xml:space="preserve">generative AI; civil engineering; construction management; services trade; NACE M71; Mode 1</w:t>
+        <w:t xml:space="preserve">generative AI; civil engineering; construction management; services trade; NACE M71; digitally deliverable services</w:t>
       </w:r>
     </w:p>
     <w:bookmarkEnd w:id="20"/>
@@ -146,15 +146,15 @@
         <w:pStyle w:val="BodyText"/>
       </w:pPr>
       <w:r>
-        <w:t xml:space="preserve">This design connects three bodies of evidence that are usually separate. Task studies show that language models can reduce the time required for writing, coding and analysis. Industry accounts reveal whether those task-level gains translate into turnover, employment or wages. Trade data show whether digitally deliverable services respond differently from project-based construction services. The contribution is not a new exposure index or a claim about aggregate GDP. It is a mode-specific comparison of domestic M71 outcomes and cross-border adjustment during the first observable generative-AI adoption wave.</w:t>
-      </w:r>
-    </w:p>
-    <w:p>
-      <w:pPr>
-        <w:pStyle w:val="BodyText"/>
-      </w:pPr>
-      <w:r>
-        <w:t xml:space="preserve">A complete replication package accompanies this submission. Missing series are catalogued there; their absence is part of the claim boundary.</w:t>
+        <w:t xml:space="preserve">This design connects three bodies of evidence that are usually separate. Task studies show that language models can reduce the time required for writing, coding and analysis. Industry accounts reveal whether those task-level gains translate into turnover, employment or wages. Trade data show whether digitally deliverable services respond differently from project-based construction services. The contribution is not a new exposure index or a claim about aggregate GDP. It is a service-heading-specific comparison of domestic M71 outcomes and cross-border adjustment during the first observable generative-AI adoption wave.</w:t>
+      </w:r>
+    </w:p>
+    <w:p>
+      <w:pPr>
+        <w:pStyle w:val="BodyText"/>
+      </w:pPr>
+      <w:r>
+        <w:t xml:space="preserve">A complete replication package accompanies this submission. All empirical specifications were rerun from the released data. The six main-text tables and five main-text figures report the results needed for the article; the accompanying supplementary-results set preserves all 34 generated tables, all 23 generated figures and the machine-readable coefficient files. Missing series are catalogued there; their absence is part of the claim boundary.</w:t>
       </w:r>
     </w:p>
     <w:p>
@@ -311,7 +311,7 @@
         <w:pStyle w:val="BodyText"/>
       </w:pPr>
       <w:r>
-        <w:t xml:space="preserve">For civil engineering, the mode split is substantive rather than administrative. Drawings and calculations can be delivered from India without the supplier establishing a local office. Construction work supplied by Chinese firms is more likely to require a project presence, equipment, subcontractors and coordination on site. OECD–WTO BaTIS balanced statistics (Fortanier et al. 2017) provide bilateral EBOPS headings that allow these margins to be compared. The finest consistently available professional category is SJ3, technical, trade-related and other business services. Bilateral SJ312 architectural and engineering services are unavailable, so Indian SJ3 should be treated as a broad upper bound rather than a count of civil-engineering invoices.</w:t>
+        <w:t xml:space="preserve">For civil engineering, the delivery margin is substantive rather than administrative. Drawings and calculations can be delivered from India without the supplier establishing a local office. Construction work supplied by Chinese firms is more likely to require a project presence, equipment, subcontractors and coordination on site. OECD–WTO BaTIS balanced statistics (Fortanier et al. 2017) provide bilateral EBOPS headings that allow these service categories to be compared, but they do not directly identify GATS modes of supply. SJ3 is therefore used as a proxy for potentially digitally deliverable cross-border work, not as a measured Mode-1 flow; SE is a project-based comparison, not a measured Mode-3 flow. The finest consistently available professional category is SJ3, technical, trade-related and other business services. Bilateral SJ312 architectural and engineering services are unavailable, so Indian SJ3 should be treated as a broad upper bound rather than a count of civil-engineering invoices.</w:t>
       </w:r>
     </w:p>
     <w:p>
@@ -807,7 +807,7 @@
         <w:pStyle w:val="BodyText"/>
       </w:pPr>
       <w:r>
-        <w:t xml:space="preserve">For the panel analysis, the headline outcome remains SJ3 imported from India. Chinese SE construction services are the project-delivery comparison. A pooled Mode-1 sample containing two additional exporters is retained as a robustness exercise but is not part of the bilateral narrative.</w:t>
+        <w:t xml:space="preserve">For the panel analysis, the headline outcome remains SJ3 imported from India. Chinese SE construction services are the project-delivery comparison. A pooled SJ3 sample containing two additional exporters is retained as a robustness exercise but is not part of the bilateral narrative.</w:t>
       </w:r>
     </w:p>
     <w:bookmarkEnd w:id="33"/>
@@ -914,7 +914,7 @@
         <w:pStyle w:val="BodyText"/>
       </w:pPr>
       <w:r>
-        <w:t xml:space="preserve">Standard errors are clustered by importer after an iterative within transformation. (t_0=2023) is reported; (t_0=2024) matches the year BaTIS still covers after the NLG jump. The India-only panel contains 119 importer-year observations. The pooled Mode-1 robustness model adds partner fixed effects and has 357 observations.</w:t>
+        <w:t xml:space="preserve">Standard errors are clustered by importer after an iterative within transformation. (t_0=2023) is reported; (t_0=2024) matches the year BaTIS still covers after the NLG jump. The India-only panel contains 119 importer-year observations. The pooled SJ3 robustness model adds partner fixed effects and has 357 observations.</w:t>
       </w:r>
     </w:p>
     <w:p>
@@ -1151,7 +1151,7 @@
         <w:pStyle w:val="FirstParagraph"/>
       </w:pPr>
       <w:r>
-        <w:t xml:space="preserve">NLG use in professional services rose sharply between 2023 and 2024, although the size of the change differed substantially across EU members (Figure 3). This cross-sectional variation identifies the preferred specification. In the pooled Mode-1 panel, the interaction for 2024 is 0.007 with a standard error of 0.003. When the sample is restricted to India, the estimate rises to 0.021 (0.008). The cross-sectional regression for the 2022–24 change in Indian SJ3 imports gives a similar positive relationship (Figure 4). Estimates for the earlier pre-period years are not statistically distinguishable from zero, although the very short post-period still calls for restraint.</w:t>
+        <w:t xml:space="preserve">NLG use in professional services rose sharply between 2023 and 2024, although the size of the change differed substantially across EU members (Figure 3). This cross-sectional variation identifies the preferred specification. In the pooled SJ3 panel, the interaction for 2024 is 0.007 with a standard error of 0.003. When the sample is restricted to India, the estimate rises to 0.021 (0.008). The cross-sectional regression for the 2022–24 change in Indian SJ3 imports gives a similar positive relationship (Figure 4). Estimates for the earlier pre-period years are not statistically distinguishable from zero, although the very short post-period still calls for restraint.</w:t>
       </w:r>
     </w:p>
     <w:p>
@@ -1167,7 +1167,7 @@
         <w:pStyle w:val="BodyText"/>
       </w:pPr>
       <w:r>
-        <w:t xml:space="preserve">Sector-level adoption measures are less discriminating. NLG changes in ICT, manufacturing and administrative services also predict SJ3 imports, while NLG use within construction does not. Thus the treatment should be understood as a national generative-AI wave observed through professional-service adoption, not as an M71-specific intervention. Within that wave, India is the corridor that carries the positive Mode-1 relationship. This is consistent with the trade-in-tasks mechanism described by Grossman and Rossi-Hansberg (2008) and Baldwin (2019), but it does not establish that every remotely supplied service or every exporting economy responded in the same way.</w:t>
+        <w:t xml:space="preserve">Sector-level adoption measures are less discriminating. NLG changes in ICT, manufacturing and administrative services also predict SJ3 imports, while NLG use within construction does not. Thus the treatment should be understood as a national generative-AI wave observed through professional-service adoption, not as an M71-specific intervention. Within that wave, India is the corridor that carries the positive SJ3 relationship. This is consistent with the trade-in-tasks mechanism described by Grossman and Rossi-Hansberg (2008) and Baldwin (2019), but it does not establish that every remotely supplied service or every exporting economy responded in the same way.</w:t>
       </w:r>
     </w:p>
     <w:bookmarkEnd w:id="44"/>
@@ -1418,12 +1418,66 @@
       </w:r>
     </w:p>
     <w:bookmarkEnd w:id="50"/>
-    <w:bookmarkStart w:id="51" w:name="disclosure-statement"/>
+    <w:bookmarkStart w:id="51" w:name="author-contribution"/>
     <w:p>
       <w:pPr>
         <w:pStyle w:val="Heading2"/>
       </w:pPr>
       <w:r>
+        <w:t xml:space="preserve">Author contribution</w:t>
+      </w:r>
+    </w:p>
+    <w:p>
+      <w:pPr>
+        <w:pStyle w:val="FirstParagraph"/>
+      </w:pPr>
+      <w:r>
+        <w:t xml:space="preserve">Yuxuan Chai is the sole author and was responsible for the study conception, data curation, analysis, visualisation and manuscript preparation.</w:t>
+      </w:r>
+    </w:p>
+    <w:bookmarkEnd w:id="51"/>
+    <w:bookmarkStart w:id="52" w:name="funding"/>
+    <w:p>
+      <w:pPr>
+        <w:pStyle w:val="Heading2"/>
+      </w:pPr>
+      <w:r>
+        <w:t xml:space="preserve">Funding</w:t>
+      </w:r>
+    </w:p>
+    <w:p>
+      <w:pPr>
+        <w:pStyle w:val="FirstParagraph"/>
+      </w:pPr>
+      <w:r>
+        <w:t xml:space="preserve">This research received no specific grant from any funding agency in the public, commercial or not-for-profit sectors.</w:t>
+      </w:r>
+    </w:p>
+    <w:bookmarkEnd w:id="52"/>
+    <w:bookmarkStart w:id="53" w:name="ethics-statement"/>
+    <w:p>
+      <w:pPr>
+        <w:pStyle w:val="Heading2"/>
+      </w:pPr>
+      <w:r>
+        <w:t xml:space="preserve">Ethics statement</w:t>
+      </w:r>
+    </w:p>
+    <w:p>
+      <w:pPr>
+        <w:pStyle w:val="FirstParagraph"/>
+      </w:pPr>
+      <w:r>
+        <w:t xml:space="preserve">The study analyses published aggregate statistical series and does not involve human participants, personal data or animal subjects.</w:t>
+      </w:r>
+    </w:p>
+    <w:bookmarkEnd w:id="53"/>
+    <w:bookmarkStart w:id="54" w:name="disclosure-statement"/>
+    <w:p>
+      <w:pPr>
+        <w:pStyle w:val="Heading2"/>
+      </w:pPr>
+      <w:r>
         <w:t xml:space="preserve">Disclosure statement</w:t>
       </w:r>
     </w:p>
@@ -1435,8 +1489,8 @@
         <w:t xml:space="preserve">No potential conflict of interest was reported by the author.</w:t>
       </w:r>
     </w:p>
-    <w:bookmarkEnd w:id="51"/>
-    <w:bookmarkStart w:id="52" w:name="data-availability-statement"/>
+    <w:bookmarkEnd w:id="54"/>
+    <w:bookmarkStart w:id="55" w:name="data-availability-statement"/>
     <w:p>
       <w:pPr>
         <w:pStyle w:val="Heading2"/>
@@ -1462,8 +1516,8 @@
         <w:t xml:space="preserve">). Eurostat, OECD–WTO BaTIS and ILOSTAT series remain subject to their publishers’ terms and should be cited as in the reference list. Author-generated files are released under CC BY 4.0.</w:t>
       </w:r>
     </w:p>
-    <w:bookmarkEnd w:id="52"/>
-    <w:bookmarkStart w:id="53" w:name="references"/>
+    <w:bookmarkEnd w:id="55"/>
+    <w:bookmarkStart w:id="56" w:name="references"/>
     <w:p>
       <w:pPr>
         <w:pStyle w:val="Heading2"/>
@@ -2133,8 +2187,8 @@
         <w:t xml:space="preserve">. World Trade Organization.</w:t>
       </w:r>
     </w:p>
-    <w:bookmarkEnd w:id="53"/>
-    <w:bookmarkStart w:id="54" w:name="tables"/>
+    <w:bookmarkEnd w:id="56"/>
+    <w:bookmarkStart w:id="57" w:name="tables"/>
     <w:p>
       <w:pPr>
         <w:pStyle w:val="Heading2"/>
@@ -3324,7 +3378,7 @@
               <w:jc w:val="left"/>
             </w:pPr>
             <w:r>
-              <w:t xml:space="preserve">Pooled Mode-1 SJ3, Post-2024 × ΔM TNLG</w:t>
+              <w:t xml:space="preserve">Pooled SJ3, Post-2024 × ΔM TNLG</w:t>
             </w:r>
           </w:p>
         </w:tc>
@@ -4240,8 +4294,8 @@
         <w:t xml:space="preserve">The table restates the claim boundary; it is not an additional statistical test.</w:t>
       </w:r>
     </w:p>
-    <w:bookmarkEnd w:id="54"/>
-    <w:bookmarkStart w:id="55" w:name="figure-captions"/>
+    <w:bookmarkEnd w:id="57"/>
+    <w:bookmarkStart w:id="58" w:name="figure-captions"/>
     <w:p>
       <w:pPr>
         <w:pStyle w:val="Heading2"/>
@@ -4340,8 +4394,8 @@
         <w:t xml:space="preserve">M71 and construction turnover growth, 2021–2024.</w:t>
       </w:r>
     </w:p>
-    <w:bookmarkEnd w:id="55"/>
-    <w:bookmarkStart w:id="71" w:name="figures"/>
+    <w:bookmarkEnd w:id="58"/>
+    <w:bookmarkStart w:id="74" w:name="figures"/>
     <w:p>
       <w:pPr>
         <w:pStyle w:val="Heading2"/>
@@ -4403,18 +4457,18 @@
           <wp:inline>
             <wp:extent cx="5334000" cy="3188804"/>
             <wp:effectExtent b="0" l="0" r="0" t="0"/>
-            <wp:docPr descr="Figure 1" title="" id="57" name="Picture"/>
+            <wp:docPr descr="Figure 1" title="" id="60" name="Picture"/>
             <a:graphic>
               <a:graphicData uri="http://schemas.openxmlformats.org/drawingml/2006/picture">
                 <pic:pic>
                   <pic:nvPicPr>
-                    <pic:cNvPr descr="figures/figure22_uk_india_china_sj3.png" id="58" name="Picture"/>
+                    <pic:cNvPr descr="figures/figure22_uk_india_china_sj3.png" id="61" name="Picture"/>
                     <pic:cNvPicPr>
                       <a:picLocks noChangeArrowheads="1" noChangeAspect="1"/>
                     </pic:cNvPicPr>
                   </pic:nvPicPr>
                   <pic:blipFill>
-                    <a:blip r:embed="rId56"/>
+                    <a:blip r:embed="rId59"/>
                     <a:stretch>
                       <a:fillRect/>
                     </a:stretch>
@@ -4468,18 +4522,18 @@
           <wp:inline>
             <wp:extent cx="5334000" cy="2133600"/>
             <wp:effectExtent b="0" l="0" r="0" t="0"/>
-            <wp:docPr descr="Figure 2" title="" id="60" name="Picture"/>
+            <wp:docPr descr="Figure 2" title="" id="63" name="Picture"/>
             <a:graphic>
               <a:graphicData uri="http://schemas.openxmlformats.org/drawingml/2006/picture">
                 <pic:pic>
                   <pic:nvPicPr>
-                    <pic:cNvPr descr="figures/figure23_uk_india_china_service_growth.png" id="61" name="Picture"/>
+                    <pic:cNvPr descr="figures/figure23_uk_india_china_service_growth.png" id="64" name="Picture"/>
                     <pic:cNvPicPr>
                       <a:picLocks noChangeArrowheads="1" noChangeAspect="1"/>
                     </pic:cNvPicPr>
                   </pic:nvPicPr>
                   <pic:blipFill>
-                    <a:blip r:embed="rId59"/>
+                    <a:blip r:embed="rId62"/>
                     <a:stretch>
                       <a:fillRect/>
                     </a:stretch>
@@ -4533,18 +4587,18 @@
           <wp:inline>
             <wp:extent cx="5334000" cy="3048000"/>
             <wp:effectExtent b="0" l="0" r="0" t="0"/>
-            <wp:docPr descr="Figure 3" title="" id="63" name="Picture"/>
+            <wp:docPr descr="Figure 3" title="" id="66" name="Picture"/>
             <a:graphic>
               <a:graphicData uri="http://schemas.openxmlformats.org/drawingml/2006/picture">
                 <pic:pic>
                   <pic:nvPicPr>
-                    <pic:cNvPr descr="figures/figure12_tnlg_vs_tml.png" id="64" name="Picture"/>
+                    <pic:cNvPr descr="figures/figure12_tnlg_vs_tml.png" id="67" name="Picture"/>
                     <pic:cNvPicPr>
                       <a:picLocks noChangeArrowheads="1" noChangeAspect="1"/>
                     </pic:cNvPicPr>
                   </pic:nvPicPr>
                   <pic:blipFill>
-                    <a:blip r:embed="rId62"/>
+                    <a:blip r:embed="rId65"/>
                     <a:stretch>
                       <a:fillRect/>
                     </a:stretch>
@@ -4598,18 +4652,18 @@
           <wp:inline>
             <wp:extent cx="5334000" cy="3765176"/>
             <wp:effectExtent b="0" l="0" r="0" t="0"/>
-            <wp:docPr descr="Figure 4" title="" id="66" name="Picture"/>
+            <wp:docPr descr="Figure 4" title="" id="69" name="Picture"/>
             <a:graphic>
               <a:graphicData uri="http://schemas.openxmlformats.org/drawingml/2006/picture">
                 <pic:pic>
                   <pic:nvPicPr>
-                    <pic:cNvPr descr="figures/figure15_cross_section_tnlg.png" id="67" name="Picture"/>
+                    <pic:cNvPr descr="figures/figure15_cross_section_tnlg.png" id="70" name="Picture"/>
                     <pic:cNvPicPr>
                       <a:picLocks noChangeArrowheads="1" noChangeAspect="1"/>
                     </pic:cNvPicPr>
                   </pic:nvPicPr>
                   <pic:blipFill>
-                    <a:blip r:embed="rId65"/>
+                    <a:blip r:embed="rId68"/>
                     <a:stretch>
                       <a:fillRect/>
                     </a:stretch>
@@ -4663,18 +4717,18 @@
           <wp:inline>
             <wp:extent cx="5334000" cy="3429000"/>
             <wp:effectExtent b="0" l="0" r="0" t="0"/>
-            <wp:docPr descr="Figure 5" title="" id="69" name="Picture"/>
+            <wp:docPr descr="Figure 5" title="" id="72" name="Picture"/>
             <a:graphic>
               <a:graphicData uri="http://schemas.openxmlformats.org/drawingml/2006/picture">
                 <pic:pic>
                   <pic:nvPicPr>
-                    <pic:cNvPr descr="figures/figure17_sbs_turnover_m71_vs_F.png" id="70" name="Picture"/>
+                    <pic:cNvPr descr="figures/figure17_sbs_turnover_m71_vs_F.png" id="73" name="Picture"/>
                     <pic:cNvPicPr>
                       <a:picLocks noChangeArrowheads="1" noChangeAspect="1"/>
                     </pic:cNvPicPr>
                   </pic:nvPicPr>
                   <pic:blipFill>
-                    <a:blip r:embed="rId68"/>
+                    <a:blip r:embed="rId71"/>
                     <a:stretch>
                       <a:fillRect/>
                     </a:stretch>
@@ -4701,8 +4755,8 @@
         </w:drawing>
       </w:r>
     </w:p>
-    <w:bookmarkEnd w:id="71"/>
-    <w:bookmarkEnd w:id="72"/>
+    <w:bookmarkEnd w:id="74"/>
+    <w:bookmarkEnd w:id="75"/>
     <w:sectPr/>
   </w:body>
 </w:document>

</xml_diff>